<commit_message>
Add Settlement Form 3106 template and related documentation
</commit_message>
<xml_diff>
--- a/Docx Files Template/Settlement Form 3106.docx
+++ b/Docx Files Template/Settlement Form 3106.docx
@@ -1,8 +1,8 @@
 
 <file path=word/document.xml><?xml version="1.0" encoding="utf-8"?>
-<w:document xmlns:wpc="http://schemas.microsoft.com/office/word/2010/wordprocessingCanvas" xmlns:cx="http://schemas.microsoft.com/office/drawing/2014/chartex" xmlns:cx1="http://schemas.microsoft.com/office/drawing/2015/9/8/chartex" xmlns:cx2="http://schemas.microsoft.com/office/drawing/2015/10/21/chartex" xmlns:cx3="http://schemas.microsoft.com/office/drawing/2016/5/9/chartex" xmlns:cx4="http://schemas.microsoft.com/office/drawing/2016/5/10/chartex" xmlns:cx5="http://schemas.microsoft.com/office/drawing/2016/5/11/chartex" xmlns:cx6="http://schemas.microsoft.com/office/drawing/2016/5/12/chartex" xmlns:cx7="http://schemas.microsoft.com/office/drawing/2016/5/13/chartex" xmlns:cx8="http://schemas.microsoft.com/office/drawing/2016/5/14/chartex" xmlns:mc="http://schemas.openxmlformats.org/markup-compatibility/2006" xmlns:aink="http://schemas.microsoft.com/office/drawing/2016/ink" xmlns:am3d="http://schemas.microsoft.com/office/drawing/2017/model3d" xmlns:o="urn:schemas-microsoft-com:office:office" xmlns:oel="http://schemas.microsoft.com/office/2019/extlst" xmlns:r="http://schemas.openxmlformats.org/officeDocument/2006/relationships" xmlns:m="http://schemas.openxmlformats.org/officeDocument/2006/math" xmlns:v="urn:schemas-microsoft-com:vml" xmlns:wp14="http://schemas.microsoft.com/office/word/2010/wordprocessingDrawing" xmlns:wp="http://schemas.openxmlformats.org/drawingml/2006/wordprocessingDrawing" xmlns:w10="urn:schemas-microsoft-com:office:word" xmlns:w="http://schemas.openxmlformats.org/wordprocessingml/2006/main" xmlns:w14="http://schemas.microsoft.com/office/word/2010/wordml" xmlns:w15="http://schemas.microsoft.com/office/word/2012/wordml" xmlns:w16cex="http://schemas.microsoft.com/office/word/2018/wordml/cex" xmlns:w16cid="http://schemas.microsoft.com/office/word/2016/wordml/cid" xmlns:w16="http://schemas.microsoft.com/office/word/2018/wordml" xmlns:w16du="http://schemas.microsoft.com/office/word/2023/wordml/word16du" xmlns:w16sdtdh="http://schemas.microsoft.com/office/word/2020/wordml/sdtdatahash" xmlns:w16sdtfl="http://schemas.microsoft.com/office/word/2024/wordml/sdtformatlock" xmlns:w16se="http://schemas.microsoft.com/office/word/2015/wordml/symex" xmlns:wpg="http://schemas.microsoft.com/office/word/2010/wordprocessingGroup" xmlns:wpi="http://schemas.microsoft.com/office/word/2010/wordprocessingInk" xmlns:wne="http://schemas.microsoft.com/office/word/2006/wordml" xmlns:wps="http://schemas.microsoft.com/office/word/2010/wordprocessingShape" mc:Ignorable="w14 w15 w16se w16cid w16 w16cex w16sdtdh w16sdtfl w16du wp14">
+<w:document xmlns:ns1="http://schemas.openxmlformats.org/markup-compatibility/2006" xmlns:ns2="http://schemas.microsoft.com/office/word/2010/wordml" xmlns:ns3="http://schemas.openxmlformats.org/drawingml/2006/wordprocessingDrawing" xmlns:ns4="http://schemas.microsoft.com/office/word/2010/wordprocessingDrawing" xmlns:ns5="http://schemas.openxmlformats.org/drawingml/2006/main" xmlns:ns6="http://schemas.openxmlformats.org/drawingml/2006/picture" xmlns:ns7="http://schemas.openxmlformats.org/officeDocument/2006/relationships" xmlns:ns8="http://schemas.microsoft.com/office/drawing/2010/main" xmlns:w="http://schemas.openxmlformats.org/wordprocessingml/2006/main" ns1:Ignorable="w14 w15 w16se w16cid w16 w16cex w16sdtdh w16sdtfl w16du wp14">
   <w:body>
-    <w:p>
+    <w:p ns2:paraId="0B93A082" ns2:textId="5FCC3587">
       <w:pPr>
         <w:rPr>
           <w:b/>
@@ -17,45 +17,45 @@
           <w:noProof/>
         </w:rPr>
         <w:drawing>
-          <wp:inline distT="0" distB="0" distL="0" distR="0" wp14:anchorId="414134BC" wp14:editId="7E3EA557">
-            <wp:extent cx="1095375" cy="670683"/>
-            <wp:effectExtent l="0" t="0" r="0" b="0"/>
-            <wp:docPr id="1935443103" name="Picture 1" descr="A red and white logo with a chain around it&#10;&#10;Description automatically generated"/>
-            <wp:cNvGraphicFramePr>
-              <a:graphicFrameLocks xmlns:a="http://schemas.openxmlformats.org/drawingml/2006/main" noChangeAspect="1"/>
-            </wp:cNvGraphicFramePr>
-            <a:graphic xmlns:a="http://schemas.openxmlformats.org/drawingml/2006/main">
-              <a:graphicData uri="http://schemas.openxmlformats.org/drawingml/2006/picture">
-                <pic:pic xmlns:pic="http://schemas.openxmlformats.org/drawingml/2006/picture">
-                  <pic:nvPicPr>
-                    <pic:cNvPr id="1935443103" name="Picture 1" descr="A red and white logo with a chain around it&#10;&#10;Description automatically generated"/>
-                    <pic:cNvPicPr/>
-                  </pic:nvPicPr>
-                  <pic:blipFill>
-                    <a:blip r:embed="rId7" cstate="print">
-                      <a:extLst>
-                        <a:ext uri="{28A0092B-C50C-407E-A947-70E740481C1C}">
-                          <a14:useLocalDpi xmlns:a14="http://schemas.microsoft.com/office/drawing/2010/main" val="0"/>
-                        </a:ext>
-                      </a:extLst>
-                    </a:blip>
-                    <a:stretch>
-                      <a:fillRect/>
-                    </a:stretch>
-                  </pic:blipFill>
-                  <pic:spPr>
-                    <a:xfrm>
-                      <a:off x="0" y="0"/>
-                      <a:ext cx="1104031" cy="675983"/>
-                    </a:xfrm>
-                    <a:prstGeom prst="rect">
-                      <a:avLst/>
-                    </a:prstGeom>
-                  </pic:spPr>
-                </pic:pic>
-              </a:graphicData>
-            </a:graphic>
-          </wp:inline>
+          <ns3:inline distT="0" distB="0" distL="0" distR="0" ns4:anchorId="414134BC" ns4:editId="7E3EA557">
+            <ns3:extent cx="1095375" cy="670683"/>
+            <ns3:effectExtent l="0" t="0" r="0" b="0"/>
+            <ns3:docPr id="1935443103" name="Picture 1" descr="A red and white logo with a chain around it&#10;&#10;Description automatically generated"/>
+            <ns3:cNvGraphicFramePr>
+              <ns5:graphicFrameLocks noChangeAspect="1"/>
+            </ns3:cNvGraphicFramePr>
+            <ns5:graphic>
+              <ns5:graphicData uri="http://schemas.openxmlformats.org/drawingml/2006/picture">
+                <ns6:pic>
+                  <ns6:nvPicPr>
+                    <ns6:cNvPr id="1935443103" name="Picture 1" descr="A red and white logo with a chain around it&#10;&#10;Description automatically generated"/>
+                    <ns6:cNvPicPr/>
+                  </ns6:nvPicPr>
+                  <ns6:blipFill>
+                    <ns5:blip ns7:embed="rId7" cstate="print">
+                      <ns5:extLst>
+                        <ns5:ext uri="{28A0092B-C50C-407E-A947-70E740481C1C}">
+                          <ns8:useLocalDpi val="0"/>
+                        </ns5:ext>
+                      </ns5:extLst>
+                    </ns5:blip>
+                    <ns5:stretch>
+                      <ns5:fillRect/>
+                    </ns5:stretch>
+                  </ns6:blipFill>
+                  <ns6:spPr>
+                    <ns5:xfrm>
+                      <ns5:off x="0" y="0"/>
+                      <ns5:ext cx="1104031" cy="675983"/>
+                    </ns5:xfrm>
+                    <ns5:prstGeom prst="rect">
+                      <ns5:avLst/>
+                    </ns5:prstGeom>
+                  </ns6:spPr>
+                </ns6:pic>
+              </ns5:graphicData>
+            </ns5:graphic>
+          </ns3:inline>
         </w:drawing>
       </w:r>
       <w:r>
@@ -89,7 +89,7 @@
         <w:t>CIO</w:t>
       </w:r>
     </w:p>
-    <w:p>
+    <w:p ns2:paraId="4C8A2397" ns2:textId="77777777">
       <w:pPr>
         <w:rPr>
           <w:b/>
@@ -100,7 +100,7 @@
         </w:rPr>
       </w:pPr>
     </w:p>
-    <w:p>
+    <w:p ns2:paraId="6B39F96E" ns2:textId="5BAC86F4">
       <w:pPr>
         <w:jc w:val="center"/>
         <w:rPr>
@@ -120,7 +120,7 @@
         <w:t>RECORD OF INFORMAL GRIEVANCE SETTLEMENT</w:t>
       </w:r>
     </w:p>
-    <w:p>
+    <w:p ns2:paraId="27EC78EE" ns2:textId="77777777">
       <w:pPr>
         <w:jc w:val="center"/>
         <w:rPr>
@@ -131,304 +131,270 @@
         </w:rPr>
       </w:pPr>
     </w:p>
+    <w:p ns2:paraId="23E8EF47" ns2:textId="40B80822">
+      <w:pPr>
+        <w:rPr>
+          <w:b/>
+          <w:bCs/>
+          <w:sz w:val="24"/>
+          <w:szCs w:val="24"/>
+        </w:rPr>
+      </w:pPr>
+      <w:r>
+        <w:rPr>
+          <w:b/>
+          <w:bCs/>
+          <w:sz w:val="24"/>
+          <w:szCs w:val="24"/>
+        </w:rPr>
+        <w:t>Grievant Name: {{ grievant_name }} Grievance # {{ grievance_number }}</w:t>
+      </w:r>
+    </w:p>
+    <w:p ns2:paraId="03B993CC" ns2:textId="519E6A39">
+      <w:pPr>
+        <w:rPr>
+          <w:b/>
+          <w:bCs/>
+          <w:sz w:val="24"/>
+          <w:szCs w:val="24"/>
+        </w:rPr>
+      </w:pPr>
+    </w:p>
+    <w:p ns2:paraId="4050C44A" ns2:textId="4DD044AF">
+      <w:pPr>
+        <w:rPr>
+          <w:b/>
+          <w:bCs/>
+          <w:sz w:val="24"/>
+          <w:szCs w:val="24"/>
+        </w:rPr>
+      </w:pPr>
+      <w:r>
+        <w:rPr>
+          <w:b/>
+          <w:bCs/>
+          <w:sz w:val="24"/>
+          <w:szCs w:val="24"/>
+        </w:rPr>
+        <w:t>Date of Informal Meeting with Management: {{ informal_meeting_date }}</w:t>
+      </w:r>
+    </w:p>
+    <w:p ns2:paraId="5F29F907" ns2:textId="635BD4ED">
+      <w:pPr>
+        <w:rPr>
+          <w:b/>
+          <w:bCs/>
+          <w:sz w:val="24"/>
+          <w:szCs w:val="24"/>
+        </w:rPr>
+      </w:pPr>
+      <w:r>
+        <w:rPr>
+          <w:b/>
+          <w:bCs/>
+          <w:sz w:val="24"/>
+          <w:szCs w:val="24"/>
+        </w:rPr>
+        <w:t>Company Representative in Attendance: {{ company_rep_attending }}</w:t>
+      </w:r>
+    </w:p>
+    <w:p ns2:paraId="24986114" ns2:textId="1E759EA2">
+      <w:pPr>
+        <w:rPr>
+          <w:b/>
+          <w:bCs/>
+          <w:sz w:val="24"/>
+          <w:szCs w:val="24"/>
+        </w:rPr>
+      </w:pPr>
+      <w:r>
+        <w:rPr>
+          <w:b/>
+          <w:bCs/>
+          <w:sz w:val="24"/>
+          <w:szCs w:val="24"/>
+        </w:rPr>
+        <w:t>Union Representative in Attendance: {{ union_rep_attending }}</w:t>
+      </w:r>
+    </w:p>
+    <w:p ns2:paraId="19410A0F" ns2:textId="77777777">
+      <w:pPr>
+        <w:rPr>
+          <w:b/>
+          <w:bCs/>
+          <w:sz w:val="24"/>
+          <w:szCs w:val="24"/>
+        </w:rPr>
+      </w:pPr>
+    </w:p>
+    <w:p ns2:paraId="75C0BC7B" ns2:textId="14EC2F82">
+      <w:pPr>
+        <w:rPr>
+          <w:b/>
+          <w:bCs/>
+          <w:sz w:val="24"/>
+          <w:szCs w:val="24"/>
+        </w:rPr>
+      </w:pPr>
+      <w:r>
+        <w:rPr>
+          <w:b/>
+          <w:bCs/>
+          <w:sz w:val="24"/>
+          <w:szCs w:val="24"/>
+        </w:rPr>
+        <w:t>Issue and Article of Contract Involved: Article#: {{ issue_article }}</w:t>
+      </w:r>
+    </w:p>
     <w:p>
       <w:pPr>
-        <w:rPr>
-          <w:b/>
-          <w:bCs/>
-          <w:sz w:val="24"/>
-          <w:szCs w:val="24"/>
-        </w:rPr>
-      </w:pPr>
-      <w:r>
-        <w:rPr>
-          <w:b/>
-          <w:bCs/>
-          <w:sz w:val="24"/>
-          <w:szCs w:val="24"/>
-        </w:rPr>
-        <w:t xml:space="preserve">Grievant Name: </w:t>
-      </w:r>
-      <w:proofErr w:type="gramStart"/>
-      <w:r>
-        <w:rPr>
-          <w:b/>
-          <w:bCs/>
-          <w:sz w:val="24"/>
-          <w:szCs w:val="24"/>
-        </w:rPr>
-        <w:t xml:space="preserve">_________________________ Grievance # </w:t>
-      </w:r>
-      <w:proofErr w:type="gramEnd"/>
-      <w:r>
-        <w:rPr>
-          <w:b/>
-          <w:bCs/>
-          <w:sz w:val="24"/>
-          <w:szCs w:val="24"/>
-        </w:rPr>
-        <w:t>_______________________</w:t>
+        <w:spacing w:before="0" w:after="0" w:line="240" w:lineRule="auto"/>
+        <w:ind w:left="0" w:right="0"/>
+      </w:pPr>
+      <w:r>
+        <w:rPr>
+          <w:rFonts w:ascii="Arial" w:hAnsi="Arial"/>
+          <w:vanish/>
+          <w:color w:val="FFFFFF"/>
+          <w:sz w:val="2"/>
+          <w:u w:val="none"/>
+        </w:rPr>
+        <w:t>{% for row in issue_rows %}</w:t>
       </w:r>
     </w:p>
     <w:p>
       <w:pPr>
-        <w:rPr>
-          <w:b/>
-          <w:bCs/>
-          <w:sz w:val="24"/>
-          <w:szCs w:val="24"/>
-        </w:rPr>
-      </w:pPr>
+        <w:spacing w:before="0" w:after="0" w:line="240" w:lineRule="auto"/>
+        <w:ind w:left="0" w:right="0"/>
+        <w:pBdr>
+          <w:bottom w:val="single" w:sz="6" w:space="1" w:color="808080"/>
+        </w:pBdr>
+      </w:pPr>
+      <w:r>
+        <w:rPr>
+          <w:rFonts w:ascii="Arial" w:hAnsi="Arial"/>
+          <w:vanish w:val="0"/>
+          <w:sz w:val="24"/>
+          <w:u w:val="none"/>
+        </w:rPr>
+        <w:t>{{ row.text }}</w:t>
+      </w:r>
     </w:p>
     <w:p>
       <w:pPr>
-        <w:rPr>
-          <w:b/>
-          <w:bCs/>
-          <w:sz w:val="24"/>
-          <w:szCs w:val="24"/>
-        </w:rPr>
-      </w:pPr>
-      <w:r>
-        <w:rPr>
-          <w:b/>
-          <w:bCs/>
-          <w:sz w:val="24"/>
-          <w:szCs w:val="24"/>
-        </w:rPr>
-        <w:t>Date of Informal Meeting with Management: _________________________________</w:t>
+        <w:spacing w:before="0" w:after="0" w:line="240" w:lineRule="auto"/>
+        <w:ind w:left="0" w:right="0"/>
+      </w:pPr>
+      <w:r>
+        <w:rPr>
+          <w:rFonts w:ascii="Arial" w:hAnsi="Arial"/>
+          <w:vanish/>
+          <w:color w:val="FFFFFF"/>
+          <w:sz w:val="2"/>
+          <w:u w:val="none"/>
+        </w:rPr>
+        <w:t>{% endfor %}</w:t>
+      </w:r>
+    </w:p>
+    <w:p ns2:paraId="1A14E894" ns2:textId="6166F3A2">
+      <w:pPr>
+        <w:rPr>
+          <w:b/>
+          <w:bCs/>
+          <w:sz w:val="24"/>
+          <w:szCs w:val="24"/>
+        </w:rPr>
+      </w:pPr>
+      <w:r>
+        <w:rPr>
+          <w:b/>
+          <w:bCs/>
+          <w:sz w:val="24"/>
+          <w:szCs w:val="24"/>
+        </w:rPr>
+        <w:t>Settlement:</w:t>
       </w:r>
     </w:p>
     <w:p>
       <w:pPr>
-        <w:rPr>
-          <w:b/>
-          <w:bCs/>
-          <w:sz w:val="24"/>
-          <w:szCs w:val="24"/>
-        </w:rPr>
-      </w:pPr>
-      <w:r>
-        <w:rPr>
-          <w:b/>
-          <w:bCs/>
-          <w:sz w:val="24"/>
-          <w:szCs w:val="24"/>
-        </w:rPr>
-        <w:t>Company Representative in Attendance: _____________________________________</w:t>
+        <w:spacing w:before="0" w:after="0" w:line="240" w:lineRule="auto"/>
+        <w:ind w:left="0" w:right="0"/>
+      </w:pPr>
+      <w:r>
+        <w:rPr>
+          <w:rFonts w:ascii="Arial" w:hAnsi="Arial"/>
+          <w:vanish/>
+          <w:color w:val="FFFFFF"/>
+          <w:sz w:val="2"/>
+          <w:u w:val="none"/>
+        </w:rPr>
+        <w:t>{% for row in settlement_rows %}</w:t>
       </w:r>
     </w:p>
     <w:p>
       <w:pPr>
-        <w:rPr>
-          <w:b/>
-          <w:bCs/>
-          <w:sz w:val="24"/>
-          <w:szCs w:val="24"/>
-        </w:rPr>
-      </w:pPr>
-      <w:r>
-        <w:rPr>
-          <w:b/>
-          <w:bCs/>
-          <w:sz w:val="24"/>
-          <w:szCs w:val="24"/>
-        </w:rPr>
-        <w:t>Union Representative in Attendance: ________________________________________</w:t>
+        <w:spacing w:before="0" w:after="0" w:line="240" w:lineRule="auto"/>
+        <w:ind w:left="0" w:right="0"/>
+        <w:pBdr>
+          <w:bottom w:val="single" w:sz="6" w:space="1" w:color="808080"/>
+        </w:pBdr>
+      </w:pPr>
+      <w:r>
+        <w:rPr>
+          <w:rFonts w:ascii="Arial" w:hAnsi="Arial"/>
+          <w:vanish w:val="0"/>
+          <w:sz w:val="24"/>
+          <w:u w:val="none"/>
+        </w:rPr>
+        <w:t>{{ row.text }}</w:t>
       </w:r>
     </w:p>
     <w:p>
       <w:pPr>
-        <w:rPr>
-          <w:b/>
-          <w:bCs/>
-          <w:sz w:val="24"/>
-          <w:szCs w:val="24"/>
-        </w:rPr>
-      </w:pPr>
-    </w:p>
-    <w:p>
-      <w:pPr>
-        <w:rPr>
-          <w:b/>
-          <w:bCs/>
-          <w:sz w:val="24"/>
-          <w:szCs w:val="24"/>
-        </w:rPr>
-      </w:pPr>
-      <w:r>
-        <w:rPr>
-          <w:b/>
-          <w:bCs/>
-          <w:sz w:val="24"/>
-          <w:szCs w:val="24"/>
-        </w:rPr>
-        <w:t>Issue and Article of Contract Involved: Article#: __________________________________</w:t>
-      </w:r>
-    </w:p>
-    <w:p>
-      <w:pPr>
-        <w:rPr>
-          <w:b/>
-          <w:bCs/>
-          <w:sz w:val="24"/>
-          <w:szCs w:val="24"/>
-        </w:rPr>
-      </w:pPr>
-      <w:r>
-        <w:rPr>
-          <w:b/>
-          <w:bCs/>
-          <w:sz w:val="24"/>
-          <w:szCs w:val="24"/>
-        </w:rPr>
-        <w:t>__________________________________________________________________________</w:t>
-      </w:r>
-    </w:p>
-    <w:p>
-      <w:pPr>
-        <w:rPr>
-          <w:b/>
-          <w:bCs/>
-          <w:sz w:val="24"/>
-          <w:szCs w:val="24"/>
-        </w:rPr>
-      </w:pPr>
-      <w:r>
-        <w:rPr>
-          <w:b/>
-          <w:bCs/>
-          <w:sz w:val="24"/>
-          <w:szCs w:val="24"/>
-        </w:rPr>
-        <w:t>__________________________________________________________________________</w:t>
-      </w:r>
-    </w:p>
-    <w:p>
-      <w:pPr>
-        <w:rPr>
-          <w:b/>
-          <w:bCs/>
-          <w:sz w:val="24"/>
-          <w:szCs w:val="24"/>
-        </w:rPr>
-      </w:pPr>
-      <w:r>
-        <w:rPr>
-          <w:b/>
-          <w:bCs/>
-          <w:sz w:val="24"/>
-          <w:szCs w:val="24"/>
-        </w:rPr>
-        <w:t>Settlement: ________________________________________________________________</w:t>
-      </w:r>
-    </w:p>
-    <w:p>
-      <w:pPr>
-        <w:rPr>
-          <w:b/>
-          <w:bCs/>
-          <w:sz w:val="24"/>
-          <w:szCs w:val="24"/>
-        </w:rPr>
-      </w:pPr>
-      <w:r>
-        <w:rPr>
-          <w:b/>
-          <w:bCs/>
-          <w:sz w:val="24"/>
-          <w:szCs w:val="24"/>
-        </w:rPr>
-        <w:t>__________________________________________________________________________</w:t>
-      </w:r>
-    </w:p>
-    <w:p>
-      <w:pPr>
-        <w:rPr>
-          <w:b/>
-          <w:bCs/>
-          <w:sz w:val="24"/>
-          <w:szCs w:val="24"/>
-        </w:rPr>
-      </w:pPr>
-      <w:r>
-        <w:rPr>
-          <w:b/>
-          <w:bCs/>
-          <w:sz w:val="24"/>
-          <w:szCs w:val="24"/>
-        </w:rPr>
-        <w:t>__________________________________________________________________________</w:t>
-      </w:r>
-    </w:p>
-    <w:p>
-      <w:pPr>
-        <w:rPr>
-          <w:b/>
-          <w:bCs/>
-          <w:sz w:val="24"/>
-          <w:szCs w:val="24"/>
-        </w:rPr>
-      </w:pPr>
-      <w:r>
-        <w:rPr>
-          <w:b/>
-          <w:bCs/>
-          <w:sz w:val="24"/>
-          <w:szCs w:val="24"/>
-        </w:rPr>
-        <w:t>__________________________________________________________________________</w:t>
-      </w:r>
-    </w:p>
-    <w:p>
-      <w:pPr>
-        <w:rPr>
-          <w:b/>
-          <w:bCs/>
-          <w:sz w:val="24"/>
-          <w:szCs w:val="24"/>
-        </w:rPr>
-      </w:pPr>
-      <w:r>
-        <w:rPr>
-          <w:b/>
-          <w:bCs/>
-          <w:sz w:val="24"/>
-          <w:szCs w:val="24"/>
-        </w:rPr>
-        <w:t>__________________________________________________________________________</w:t>
-      </w:r>
-    </w:p>
-    <w:p>
-      <w:pPr>
-        <w:rPr>
-          <w:b/>
-          <w:bCs/>
-          <w:sz w:val="24"/>
-          <w:szCs w:val="24"/>
-        </w:rPr>
-      </w:pPr>
-    </w:p>
-    <w:p>
-      <w:pPr>
-        <w:rPr>
-          <w:b/>
-          <w:bCs/>
-          <w:sz w:val="24"/>
-          <w:szCs w:val="24"/>
-        </w:rPr>
-      </w:pPr>
-      <w:r>
-        <w:rPr>
-          <w:b/>
-          <w:bCs/>
-          <w:sz w:val="24"/>
-          <w:szCs w:val="24"/>
-        </w:rPr>
-        <w:t>_____________________________                          _______________________________</w:t>
-      </w:r>
-    </w:p>
-    <w:p>
+        <w:spacing w:before="0" w:after="0" w:line="240" w:lineRule="auto"/>
+        <w:ind w:left="0" w:right="0"/>
+      </w:pPr>
+      <w:r>
+        <w:rPr>
+          <w:rFonts w:ascii="Arial" w:hAnsi="Arial"/>
+          <w:vanish/>
+          <w:color w:val="FFFFFF"/>
+          <w:sz w:val="2"/>
+          <w:u w:val="none"/>
+        </w:rPr>
+        <w:t>{% endfor %}</w:t>
+      </w:r>
+    </w:p>
+    <w:p ns2:paraId="21B79177" ns2:textId="77777777">
+      <w:pPr>
+        <w:rPr>
+          <w:b/>
+          <w:bCs/>
+          <w:sz w:val="24"/>
+          <w:szCs w:val="24"/>
+        </w:rPr>
+      </w:pPr>
+    </w:p>
+    <w:p ns2:paraId="06B57E51" ns2:textId="15EE5257">
+      <w:pPr>
+        <w:rPr>
+          <w:b/>
+          <w:bCs/>
+          <w:sz w:val="24"/>
+          <w:szCs w:val="24"/>
+        </w:rPr>
+      </w:pPr>
+      <w:r>
+        <w:rPr>
+          <w:b/>
+          <w:bCs/>
+          <w:sz w:val="24"/>
+          <w:szCs w:val="24"/>
+        </w:rPr>
+        <w:t>{{ Sig_es_:signer1:signature }}                          {{ Sig_es_:signer2:signature }}</w:t>
+      </w:r>
+    </w:p>
+    <w:p ns2:paraId="673FDE6F" ns2:textId="4335DBB2">
       <w:pPr>
         <w:rPr>
           <w:b/>
@@ -447,26 +413,26 @@
         <w:t>Company Representative Signature                          Steward Signature</w:t>
       </w:r>
     </w:p>
-    <w:p>
-      <w:pPr>
-        <w:rPr>
-          <w:b/>
-          <w:bCs/>
-          <w:sz w:val="24"/>
-          <w:szCs w:val="24"/>
-        </w:rPr>
-      </w:pPr>
-      <w:r>
-        <w:rPr>
-          <w:b/>
-          <w:bCs/>
-          <w:sz w:val="24"/>
-          <w:szCs w:val="24"/>
-        </w:rPr>
-        <w:t xml:space="preserve">                                                                                           ________________________________</w:t>
-      </w:r>
-    </w:p>
-    <w:p>
+    <w:p ns2:paraId="44A258AA" ns2:textId="7D8C624B">
+      <w:pPr>
+        <w:rPr>
+          <w:b/>
+          <w:bCs/>
+          <w:sz w:val="24"/>
+          <w:szCs w:val="24"/>
+        </w:rPr>
+      </w:pPr>
+      <w:r>
+        <w:rPr>
+          <w:b/>
+          <w:bCs/>
+          <w:sz w:val="24"/>
+          <w:szCs w:val="24"/>
+        </w:rPr>
+        <w:t>                                                                                           {{ Sig_es_:signer3:signature }}</w:t>
+      </w:r>
+    </w:p>
+    <w:p ns2:paraId="630E5731" ns2:textId="2CFDEC2F">
       <w:pPr>
         <w:rPr>
           <w:b/>

</xml_diff>

<commit_message>
Add operations API for grievance case management
- Implemented local access restriction for ops endpoints.
- Created HTML interface for ops operations including loading case trace, resending signature emails, and resubmitting cases.
- Added endpoint to load case trace with detailed information about the case, documents, events, and outbound emails.
- Developed functionality to resend signature emails for documents requiring signatures.
- Implemented case resubmission with updated request ID and intake payload handling.
</commit_message>
<xml_diff>
--- a/Docx Files Template/Settlement Form 3106.docx
+++ b/Docx Files Template/Settlement Form 3106.docx
@@ -1,8 +1,8 @@
 
 <file path=word/document.xml><?xml version="1.0" encoding="utf-8"?>
-<w:document xmlns:ns1="http://schemas.openxmlformats.org/markup-compatibility/2006" xmlns:ns2="http://schemas.microsoft.com/office/word/2010/wordml" xmlns:ns3="http://schemas.openxmlformats.org/drawingml/2006/wordprocessingDrawing" xmlns:ns4="http://schemas.microsoft.com/office/word/2010/wordprocessingDrawing" xmlns:ns5="http://schemas.openxmlformats.org/drawingml/2006/main" xmlns:ns6="http://schemas.openxmlformats.org/drawingml/2006/picture" xmlns:ns7="http://schemas.openxmlformats.org/officeDocument/2006/relationships" xmlns:ns8="http://schemas.microsoft.com/office/drawing/2010/main" xmlns:w="http://schemas.openxmlformats.org/wordprocessingml/2006/main" ns1:Ignorable="w14 w15 w16se w16cid w16 w16cex w16sdtdh w16sdtfl w16du wp14">
+<w:document xmlns:wpc="http://schemas.microsoft.com/office/word/2010/wordprocessingCanvas" xmlns:cx="http://schemas.microsoft.com/office/drawing/2014/chartex" xmlns:cx1="http://schemas.microsoft.com/office/drawing/2015/9/8/chartex" xmlns:cx2="http://schemas.microsoft.com/office/drawing/2015/10/21/chartex" xmlns:cx3="http://schemas.microsoft.com/office/drawing/2016/5/9/chartex" xmlns:cx4="http://schemas.microsoft.com/office/drawing/2016/5/10/chartex" xmlns:cx5="http://schemas.microsoft.com/office/drawing/2016/5/11/chartex" xmlns:cx6="http://schemas.microsoft.com/office/drawing/2016/5/12/chartex" xmlns:cx7="http://schemas.microsoft.com/office/drawing/2016/5/13/chartex" xmlns:cx8="http://schemas.microsoft.com/office/drawing/2016/5/14/chartex" xmlns:mc="http://schemas.openxmlformats.org/markup-compatibility/2006" xmlns:aink="http://schemas.microsoft.com/office/drawing/2016/ink" xmlns:am3d="http://schemas.microsoft.com/office/drawing/2017/model3d" xmlns:o="urn:schemas-microsoft-com:office:office" xmlns:oel="http://schemas.microsoft.com/office/2019/extlst" xmlns:r="http://schemas.openxmlformats.org/officeDocument/2006/relationships" xmlns:m="http://schemas.openxmlformats.org/officeDocument/2006/math" xmlns:v="urn:schemas-microsoft-com:vml" xmlns:wp14="http://schemas.microsoft.com/office/word/2010/wordprocessingDrawing" xmlns:wp="http://schemas.openxmlformats.org/drawingml/2006/wordprocessingDrawing" xmlns:w10="urn:schemas-microsoft-com:office:word" xmlns:w="http://schemas.openxmlformats.org/wordprocessingml/2006/main" xmlns:w14="http://schemas.microsoft.com/office/word/2010/wordml" xmlns:w15="http://schemas.microsoft.com/office/word/2012/wordml" xmlns:w16cex="http://schemas.microsoft.com/office/word/2018/wordml/cex" xmlns:w16cid="http://schemas.microsoft.com/office/word/2016/wordml/cid" xmlns:w16="http://schemas.microsoft.com/office/word/2018/wordml" xmlns:w16du="http://schemas.microsoft.com/office/word/2023/wordml/word16du" xmlns:w16sdtdh="http://schemas.microsoft.com/office/word/2020/wordml/sdtdatahash" xmlns:w16sdtfl="http://schemas.microsoft.com/office/word/2024/wordml/sdtformatlock" xmlns:w16se="http://schemas.microsoft.com/office/word/2015/wordml/symex" xmlns:wpg="http://schemas.microsoft.com/office/word/2010/wordprocessingGroup" xmlns:wpi="http://schemas.microsoft.com/office/word/2010/wordprocessingInk" xmlns:wne="http://schemas.microsoft.com/office/word/2006/wordml" xmlns:wps="http://schemas.microsoft.com/office/word/2010/wordprocessingShape" mc:Ignorable="w14 w15 w16se w16cid w16 w16cex w16sdtdh w16sdtfl w16du wp14">
   <w:body>
-    <w:p ns2:paraId="0B93A082" ns2:textId="5FCC3587">
+    <w:p>
       <w:pPr>
         <w:rPr>
           <w:b/>
@@ -17,45 +17,45 @@
           <w:noProof/>
         </w:rPr>
         <w:drawing>
-          <ns3:inline distT="0" distB="0" distL="0" distR="0" ns4:anchorId="414134BC" ns4:editId="7E3EA557">
-            <ns3:extent cx="1095375" cy="670683"/>
-            <ns3:effectExtent l="0" t="0" r="0" b="0"/>
-            <ns3:docPr id="1935443103" name="Picture 1" descr="A red and white logo with a chain around it&#10;&#10;Description automatically generated"/>
-            <ns3:cNvGraphicFramePr>
-              <ns5:graphicFrameLocks noChangeAspect="1"/>
-            </ns3:cNvGraphicFramePr>
-            <ns5:graphic>
-              <ns5:graphicData uri="http://schemas.openxmlformats.org/drawingml/2006/picture">
-                <ns6:pic>
-                  <ns6:nvPicPr>
-                    <ns6:cNvPr id="1935443103" name="Picture 1" descr="A red and white logo with a chain around it&#10;&#10;Description automatically generated"/>
-                    <ns6:cNvPicPr/>
-                  </ns6:nvPicPr>
-                  <ns6:blipFill>
-                    <ns5:blip ns7:embed="rId7" cstate="print">
-                      <ns5:extLst>
-                        <ns5:ext uri="{28A0092B-C50C-407E-A947-70E740481C1C}">
-                          <ns8:useLocalDpi val="0"/>
-                        </ns5:ext>
-                      </ns5:extLst>
-                    </ns5:blip>
-                    <ns5:stretch>
-                      <ns5:fillRect/>
-                    </ns5:stretch>
-                  </ns6:blipFill>
-                  <ns6:spPr>
-                    <ns5:xfrm>
-                      <ns5:off x="0" y="0"/>
-                      <ns5:ext cx="1104031" cy="675983"/>
-                    </ns5:xfrm>
-                    <ns5:prstGeom prst="rect">
-                      <ns5:avLst/>
-                    </ns5:prstGeom>
-                  </ns6:spPr>
-                </ns6:pic>
-              </ns5:graphicData>
-            </ns5:graphic>
-          </ns3:inline>
+          <wp:inline distT="0" distB="0" distL="0" distR="0" wp14:anchorId="414134BC" wp14:editId="7E3EA557">
+            <wp:extent cx="1095375" cy="670683"/>
+            <wp:effectExtent l="0" t="0" r="0" b="0"/>
+            <wp:docPr id="1935443103" name="Picture 1" descr="A red and white logo with a chain around it&#10;&#10;Description automatically generated"/>
+            <wp:cNvGraphicFramePr>
+              <a:graphicFrameLocks xmlns:a="http://schemas.openxmlformats.org/drawingml/2006/main" noChangeAspect="1"/>
+            </wp:cNvGraphicFramePr>
+            <a:graphic xmlns:a="http://schemas.openxmlformats.org/drawingml/2006/main">
+              <a:graphicData uri="http://schemas.openxmlformats.org/drawingml/2006/picture">
+                <pic:pic xmlns:pic="http://schemas.openxmlformats.org/drawingml/2006/picture">
+                  <pic:nvPicPr>
+                    <pic:cNvPr id="1935443103" name="Picture 1" descr="A red and white logo with a chain around it&#10;&#10;Description automatically generated"/>
+                    <pic:cNvPicPr/>
+                  </pic:nvPicPr>
+                  <pic:blipFill>
+                    <a:blip r:embed="rId7" cstate="print">
+                      <a:extLst>
+                        <a:ext uri="{28A0092B-C50C-407E-A947-70E740481C1C}">
+                          <a14:useLocalDpi xmlns:a14="http://schemas.microsoft.com/office/drawing/2010/main" val="0"/>
+                        </a:ext>
+                      </a:extLst>
+                    </a:blip>
+                    <a:stretch>
+                      <a:fillRect/>
+                    </a:stretch>
+                  </pic:blipFill>
+                  <pic:spPr>
+                    <a:xfrm>
+                      <a:off x="0" y="0"/>
+                      <a:ext cx="1104031" cy="675983"/>
+                    </a:xfrm>
+                    <a:prstGeom prst="rect">
+                      <a:avLst/>
+                    </a:prstGeom>
+                  </pic:spPr>
+                </pic:pic>
+              </a:graphicData>
+            </a:graphic>
+          </wp:inline>
         </w:drawing>
       </w:r>
       <w:r>
@@ -89,7 +89,7 @@
         <w:t>CIO</w:t>
       </w:r>
     </w:p>
-    <w:p ns2:paraId="4C8A2397" ns2:textId="77777777">
+    <w:p>
       <w:pPr>
         <w:rPr>
           <w:b/>
@@ -100,7 +100,7 @@
         </w:rPr>
       </w:pPr>
     </w:p>
-    <w:p ns2:paraId="6B39F96E" ns2:textId="5BAC86F4">
+    <w:p>
       <w:pPr>
         <w:jc w:val="center"/>
         <w:rPr>
@@ -120,7 +120,7 @@
         <w:t>RECORD OF INFORMAL GRIEVANCE SETTLEMENT</w:t>
       </w:r>
     </w:p>
-    <w:p ns2:paraId="27EC78EE" ns2:textId="77777777">
+    <w:p>
       <w:pPr>
         <w:jc w:val="center"/>
         <w:rPr>
@@ -131,7 +131,177 @@
         </w:rPr>
       </w:pPr>
     </w:p>
-    <w:p ns2:paraId="23E8EF47" ns2:textId="40B80822">
+    <w:tbl>
+      <w:tblPr>
+        <w:tblStyle w:val="TableGrid"/>
+        <w:tblW w:w="0" w:type="auto"/>
+        <w:tblLook w:val="04A0" w:firstRow="1" w:lastRow="0" w:firstColumn="1" w:lastColumn="0" w:noHBand="0" w:noVBand="1"/>
+      </w:tblPr>
+      <w:tblGrid>
+        <w:gridCol w:w="2337"/>
+        <w:gridCol w:w="2338"/>
+        <w:gridCol w:w="2337"/>
+        <w:gridCol w:w="2338"/>
+      </w:tblGrid>
+      <w:tr>
+        <w:tc>
+          <w:tcPr>
+            <w:tcW w:w="2337" w:type="dxa"/>
+            <w:tcBorders>
+              <w:top w:val="nil"/>
+              <w:left w:val="nil"/>
+              <w:bottom w:val="nil"/>
+              <w:right w:val="nil"/>
+            </w:tcBorders>
+            <w:vAlign w:val="bottom"/>
+          </w:tcPr>
+          <w:p>
+            <w:pPr>
+              <w:rPr>
+                <w:b/>
+                <w:bCs/>
+                <w:sz w:val="24"/>
+                <w:szCs w:val="24"/>
+              </w:rPr>
+            </w:pPr>
+            <w:r>
+              <w:rPr>
+                <w:b/>
+                <w:bCs/>
+                <w:sz w:val="24"/>
+                <w:szCs w:val="24"/>
+              </w:rPr>
+              <w:t>Grievant Name:</w:t>
+            </w:r>
+          </w:p>
+        </w:tc>
+        <w:tc>
+          <w:tcPr>
+            <w:tcW w:w="2338" w:type="dxa"/>
+            <w:tcBorders>
+              <w:top w:val="nil"/>
+              <w:left w:val="nil"/>
+              <w:bottom w:val="single" w:sz="8" w:space="0" w:color="auto"/>
+              <w:right w:val="nil"/>
+            </w:tcBorders>
+            <w:vAlign w:val="bottom"/>
+          </w:tcPr>
+          <w:p>
+            <w:pPr>
+              <w:jc w:val="center"/>
+              <w:rPr>
+                <w:b/>
+                <w:bCs/>
+                <w:sz w:val="24"/>
+                <w:szCs w:val="24"/>
+              </w:rPr>
+            </w:pPr>
+            <w:r>
+              <w:rPr>
+                <w:sz w:val="24"/>
+                <w:szCs w:val="24"/>
+              </w:rPr>
+              <w:t xml:space="preserve">{{ </w:t>
+            </w:r>
+            <w:proofErr w:type="spellStart"/>
+            <w:r>
+              <w:rPr>
+                <w:sz w:val="24"/>
+                <w:szCs w:val="24"/>
+              </w:rPr>
+              <w:t>grievant_name</w:t>
+            </w:r>
+            <w:proofErr w:type="spellEnd"/>
+            <w:r>
+              <w:rPr>
+                <w:sz w:val="24"/>
+                <w:szCs w:val="24"/>
+              </w:rPr>
+              <w:t xml:space="preserve"> }}</w:t>
+            </w:r>
+          </w:p>
+        </w:tc>
+        <w:tc>
+          <w:tcPr>
+            <w:tcW w:w="2337" w:type="dxa"/>
+            <w:tcBorders>
+              <w:top w:val="nil"/>
+              <w:left w:val="nil"/>
+              <w:bottom w:val="nil"/>
+              <w:right w:val="nil"/>
+            </w:tcBorders>
+            <w:vAlign w:val="bottom"/>
+          </w:tcPr>
+          <w:p>
+            <w:pPr>
+              <w:jc w:val="center"/>
+              <w:rPr>
+                <w:b/>
+                <w:bCs/>
+                <w:sz w:val="24"/>
+                <w:szCs w:val="24"/>
+              </w:rPr>
+            </w:pPr>
+            <w:r>
+              <w:rPr>
+                <w:b/>
+                <w:bCs/>
+                <w:sz w:val="24"/>
+                <w:szCs w:val="24"/>
+              </w:rPr>
+              <w:t>Grievance #</w:t>
+            </w:r>
+          </w:p>
+        </w:tc>
+        <w:tc>
+          <w:tcPr>
+            <w:tcW w:w="2338" w:type="dxa"/>
+            <w:tcBorders>
+              <w:top w:val="nil"/>
+              <w:left w:val="nil"/>
+              <w:bottom w:val="single" w:sz="8" w:space="0" w:color="auto"/>
+              <w:right w:val="nil"/>
+            </w:tcBorders>
+            <w:vAlign w:val="bottom"/>
+          </w:tcPr>
+          <w:p>
+            <w:pPr>
+              <w:jc w:val="right"/>
+              <w:rPr>
+                <w:b/>
+                <w:bCs/>
+                <w:sz w:val="24"/>
+                <w:szCs w:val="24"/>
+              </w:rPr>
+            </w:pPr>
+            <w:r>
+              <w:rPr>
+                <w:sz w:val="24"/>
+                <w:szCs w:val="24"/>
+              </w:rPr>
+              <w:t xml:space="preserve">{{ </w:t>
+            </w:r>
+            <w:proofErr w:type="spellStart"/>
+            <w:r>
+              <w:rPr>
+                <w:sz w:val="24"/>
+                <w:szCs w:val="24"/>
+              </w:rPr>
+              <w:t>grievance_number</w:t>
+            </w:r>
+            <w:proofErr w:type="spellEnd"/>
+            <w:r>
+              <w:rPr>
+                <w:sz w:val="24"/>
+                <w:szCs w:val="24"/>
+              </w:rPr>
+              <w:t xml:space="preserve"> }}</w:t>
+            </w:r>
+          </w:p>
+        </w:tc>
+      </w:tr>
+    </w:tbl>
+    <w:p>
       <w:pPr>
         <w:rPr>
           <w:b/>
@@ -140,17 +310,368 @@
           <w:szCs w:val="24"/>
         </w:rPr>
       </w:pPr>
-      <w:r>
+    </w:p>
+    <w:p>
+      <w:pPr>
         <w:rPr>
           <w:b/>
           <w:bCs/>
           <w:sz w:val="24"/>
           <w:szCs w:val="24"/>
         </w:rPr>
-        <w:t>Grievant Name: {{ grievant_name }} Grievance # {{ grievance_number }}</w:t>
-      </w:r>
+      </w:pPr>
     </w:p>
-    <w:p ns2:paraId="03B993CC" ns2:textId="519E6A39">
+    <w:tbl>
+      <w:tblPr>
+        <w:tblStyle w:val="TableGrid"/>
+        <w:tblW w:w="0" w:type="auto"/>
+        <w:tblLook w:val="04A0" w:firstRow="1" w:lastRow="0" w:firstColumn="1" w:lastColumn="0" w:noHBand="0" w:noVBand="1"/>
+      </w:tblPr>
+      <w:tblGrid>
+        <w:gridCol w:w="1054"/>
+        <w:gridCol w:w="2945"/>
+        <w:gridCol w:w="268"/>
+        <w:gridCol w:w="530"/>
+        <w:gridCol w:w="4563"/>
+      </w:tblGrid>
+      <w:tr>
+        <w:trPr>
+          <w:trHeight w:val="287"/>
+        </w:trPr>
+        <w:tc>
+          <w:tcPr>
+            <w:tcW w:w="4797" w:type="dxa"/>
+            <w:gridSpan w:val="4"/>
+            <w:tcBorders>
+              <w:top w:val="nil"/>
+              <w:left w:val="nil"/>
+              <w:bottom w:val="nil"/>
+              <w:right w:val="nil"/>
+            </w:tcBorders>
+            <w:vAlign w:val="bottom"/>
+          </w:tcPr>
+          <w:p>
+            <w:pPr>
+              <w:rPr>
+                <w:sz w:val="24"/>
+                <w:szCs w:val="24"/>
+              </w:rPr>
+            </w:pPr>
+            <w:r>
+              <w:rPr>
+                <w:b/>
+                <w:bCs/>
+                <w:sz w:val="24"/>
+                <w:szCs w:val="24"/>
+              </w:rPr>
+              <w:t xml:space="preserve">Date of Informal Meeting with Management: </w:t>
+            </w:r>
+          </w:p>
+        </w:tc>
+        <w:tc>
+          <w:tcPr>
+            <w:tcW w:w="4563" w:type="dxa"/>
+            <w:tcBorders>
+              <w:top w:val="nil"/>
+              <w:left w:val="nil"/>
+              <w:bottom w:val="single" w:sz="8" w:space="0" w:color="auto"/>
+              <w:right w:val="nil"/>
+            </w:tcBorders>
+            <w:vAlign w:val="bottom"/>
+          </w:tcPr>
+          <w:p>
+            <w:pPr>
+              <w:rPr>
+                <w:sz w:val="24"/>
+                <w:szCs w:val="24"/>
+              </w:rPr>
+            </w:pPr>
+            <w:r>
+              <w:rPr>
+                <w:sz w:val="24"/>
+                <w:szCs w:val="24"/>
+              </w:rPr>
+              <w:t xml:space="preserve">{{ </w:t>
+            </w:r>
+            <w:proofErr w:type="spellStart"/>
+            <w:r>
+              <w:rPr>
+                <w:sz w:val="24"/>
+                <w:szCs w:val="24"/>
+              </w:rPr>
+              <w:t>informal_meeting_date</w:t>
+            </w:r>
+            <w:proofErr w:type="spellEnd"/>
+            <w:r>
+              <w:rPr>
+                <w:sz w:val="24"/>
+                <w:szCs w:val="24"/>
+              </w:rPr>
+              <w:t xml:space="preserve"> }}</w:t>
+            </w:r>
+          </w:p>
+        </w:tc>
+      </w:tr>
+      <w:tr>
+        <w:tc>
+          <w:tcPr>
+            <w:tcW w:w="4267" w:type="dxa"/>
+            <w:gridSpan w:val="3"/>
+            <w:tcBorders>
+              <w:top w:val="nil"/>
+              <w:left w:val="nil"/>
+              <w:bottom w:val="nil"/>
+              <w:right w:val="nil"/>
+            </w:tcBorders>
+            <w:vAlign w:val="bottom"/>
+          </w:tcPr>
+          <w:p>
+            <w:pPr>
+              <w:rPr>
+                <w:b/>
+                <w:bCs/>
+                <w:sz w:val="24"/>
+                <w:szCs w:val="24"/>
+              </w:rPr>
+            </w:pPr>
+            <w:r>
+              <w:rPr>
+                <w:b/>
+                <w:bCs/>
+                <w:sz w:val="24"/>
+                <w:szCs w:val="24"/>
+              </w:rPr>
+              <w:t>Company Representative in Attendance:</w:t>
+            </w:r>
+          </w:p>
+        </w:tc>
+        <w:tc>
+          <w:tcPr>
+            <w:tcW w:w="5093" w:type="dxa"/>
+            <w:gridSpan w:val="2"/>
+            <w:tcBorders>
+              <w:left w:val="nil"/>
+              <w:bottom w:val="single" w:sz="8" w:space="0" w:color="auto"/>
+              <w:right w:val="nil"/>
+            </w:tcBorders>
+            <w:vAlign w:val="bottom"/>
+          </w:tcPr>
+          <w:p>
+            <w:pPr>
+              <w:rPr>
+                <w:b/>
+                <w:bCs/>
+                <w:sz w:val="24"/>
+                <w:szCs w:val="24"/>
+              </w:rPr>
+            </w:pPr>
+            <w:r>
+              <w:rPr>
+                <w:sz w:val="24"/>
+                <w:szCs w:val="24"/>
+              </w:rPr>
+              <w:t xml:space="preserve">{{ </w:t>
+            </w:r>
+            <w:proofErr w:type="spellStart"/>
+            <w:r>
+              <w:rPr>
+                <w:sz w:val="24"/>
+                <w:szCs w:val="24"/>
+              </w:rPr>
+              <w:t>company_rep_attending</w:t>
+            </w:r>
+            <w:proofErr w:type="spellEnd"/>
+            <w:r>
+              <w:rPr>
+                <w:sz w:val="24"/>
+                <w:szCs w:val="24"/>
+              </w:rPr>
+              <w:t xml:space="preserve"> }}</w:t>
+            </w:r>
+          </w:p>
+        </w:tc>
+      </w:tr>
+      <w:tr>
+        <w:tc>
+          <w:tcPr>
+            <w:tcW w:w="3999" w:type="dxa"/>
+            <w:gridSpan w:val="2"/>
+            <w:tcBorders>
+              <w:top w:val="nil"/>
+              <w:left w:val="nil"/>
+              <w:bottom w:val="nil"/>
+              <w:right w:val="nil"/>
+            </w:tcBorders>
+            <w:vAlign w:val="bottom"/>
+          </w:tcPr>
+          <w:p>
+            <w:pPr>
+              <w:rPr>
+                <w:sz w:val="24"/>
+                <w:szCs w:val="24"/>
+              </w:rPr>
+            </w:pPr>
+            <w:r>
+              <w:rPr>
+                <w:b/>
+                <w:bCs/>
+                <w:sz w:val="24"/>
+                <w:szCs w:val="24"/>
+              </w:rPr>
+              <w:t xml:space="preserve">Union Representative in Attendance: </w:t>
+            </w:r>
+          </w:p>
+        </w:tc>
+        <w:tc>
+          <w:tcPr>
+            <w:tcW w:w="5361" w:type="dxa"/>
+            <w:gridSpan w:val="3"/>
+            <w:tcBorders>
+              <w:left w:val="nil"/>
+              <w:bottom w:val="single" w:sz="8" w:space="0" w:color="auto"/>
+              <w:right w:val="nil"/>
+            </w:tcBorders>
+            <w:vAlign w:val="bottom"/>
+          </w:tcPr>
+          <w:p>
+            <w:pPr>
+              <w:rPr>
+                <w:sz w:val="24"/>
+                <w:szCs w:val="24"/>
+              </w:rPr>
+            </w:pPr>
+            <w:r>
+              <w:rPr>
+                <w:sz w:val="24"/>
+                <w:szCs w:val="24"/>
+              </w:rPr>
+              <w:t xml:space="preserve">{{ </w:t>
+            </w:r>
+            <w:proofErr w:type="spellStart"/>
+            <w:r>
+              <w:rPr>
+                <w:sz w:val="24"/>
+                <w:szCs w:val="24"/>
+              </w:rPr>
+              <w:t>union_rep_attending</w:t>
+            </w:r>
+            <w:proofErr w:type="spellEnd"/>
+            <w:r>
+              <w:rPr>
+                <w:sz w:val="24"/>
+                <w:szCs w:val="24"/>
+              </w:rPr>
+              <w:t xml:space="preserve"> }}</w:t>
+            </w:r>
+          </w:p>
+        </w:tc>
+      </w:tr>
+      <w:tr>
+        <w:tc>
+          <w:tcPr>
+            <w:tcW w:w="1054" w:type="dxa"/>
+            <w:tcBorders>
+              <w:top w:val="nil"/>
+              <w:left w:val="nil"/>
+              <w:bottom w:val="nil"/>
+              <w:right w:val="nil"/>
+            </w:tcBorders>
+          </w:tcPr>
+          <w:p>
+            <w:pPr>
+              <w:rPr>
+                <w:b/>
+                <w:bCs/>
+                <w:sz w:val="24"/>
+                <w:szCs w:val="24"/>
+              </w:rPr>
+            </w:pPr>
+            <w:r>
+              <w:rPr>
+                <w:b/>
+                <w:bCs/>
+                <w:sz w:val="24"/>
+                <w:szCs w:val="24"/>
+              </w:rPr>
+              <w:t xml:space="preserve">Article#: </w:t>
+            </w:r>
+          </w:p>
+        </w:tc>
+        <w:tc>
+          <w:tcPr>
+            <w:tcW w:w="8306" w:type="dxa"/>
+            <w:gridSpan w:val="4"/>
+            <w:tcBorders>
+              <w:top w:val="nil"/>
+              <w:left w:val="nil"/>
+              <w:bottom w:val="single" w:sz="8" w:space="0" w:color="auto"/>
+              <w:right w:val="nil"/>
+            </w:tcBorders>
+          </w:tcPr>
+          <w:p>
+            <w:pPr>
+              <w:rPr>
+                <w:b/>
+                <w:bCs/>
+                <w:sz w:val="24"/>
+                <w:szCs w:val="24"/>
+              </w:rPr>
+            </w:pPr>
+            <w:r>
+              <w:rPr>
+                <w:sz w:val="24"/>
+                <w:szCs w:val="24"/>
+              </w:rPr>
+              <w:t xml:space="preserve">{{ </w:t>
+            </w:r>
+            <w:proofErr w:type="spellStart"/>
+            <w:r>
+              <w:rPr>
+                <w:sz w:val="24"/>
+                <w:szCs w:val="24"/>
+              </w:rPr>
+              <w:t>issue_article</w:t>
+            </w:r>
+            <w:proofErr w:type="spellEnd"/>
+            <w:r>
+              <w:rPr>
+                <w:sz w:val="24"/>
+                <w:szCs w:val="24"/>
+              </w:rPr>
+              <w:t xml:space="preserve"> }}</w:t>
+            </w:r>
+          </w:p>
+        </w:tc>
+      </w:tr>
+      <w:tr>
+        <w:tc>
+          <w:tcPr>
+            <w:tcW w:w="9350" w:type="dxa"/>
+            <w:gridSpan w:val="5"/>
+          </w:tcPr>
+          <w:p>
+            <w:pPr>
+              <w:rPr>
+                <w:b/>
+                <w:bCs/>
+                <w:sz w:val="24"/>
+                <w:szCs w:val="24"/>
+              </w:rPr>
+            </w:pPr>
+            <w:r>
+              <w:rPr>
+                <w:b/>
+                <w:bCs/>
+                <w:sz w:val="24"/>
+                <w:szCs w:val="24"/>
+              </w:rPr>
+              <w:t>Issue and Article of Contract Involved:</w:t>
+            </w:r>
+          </w:p>
+        </w:tc>
+      </w:tr>
+    </w:tbl>
+    <w:p>
       <w:pPr>
         <w:rPr>
           <w:b/>
@@ -159,97 +680,19 @@
           <w:szCs w:val="24"/>
         </w:rPr>
       </w:pPr>
-    </w:p>
-    <w:p ns2:paraId="4050C44A" ns2:textId="4DD044AF">
-      <w:pPr>
+      <w:r>
         <w:rPr>
           <w:b/>
           <w:bCs/>
           <w:sz w:val="24"/>
           <w:szCs w:val="24"/>
         </w:rPr>
-      </w:pPr>
-      <w:r>
-        <w:rPr>
-          <w:b/>
-          <w:bCs/>
-          <w:sz w:val="24"/>
-          <w:szCs w:val="24"/>
-        </w:rPr>
-        <w:t>Date of Informal Meeting with Management: {{ informal_meeting_date }}</w:t>
-      </w:r>
-    </w:p>
-    <w:p ns2:paraId="5F29F907" ns2:textId="635BD4ED">
-      <w:pPr>
-        <w:rPr>
-          <w:b/>
-          <w:bCs/>
-          <w:sz w:val="24"/>
-          <w:szCs w:val="24"/>
-        </w:rPr>
-      </w:pPr>
-      <w:r>
-        <w:rPr>
-          <w:b/>
-          <w:bCs/>
-          <w:sz w:val="24"/>
-          <w:szCs w:val="24"/>
-        </w:rPr>
-        <w:t>Company Representative in Attendance: {{ company_rep_attending }}</w:t>
-      </w:r>
-    </w:p>
-    <w:p ns2:paraId="24986114" ns2:textId="1E759EA2">
-      <w:pPr>
-        <w:rPr>
-          <w:b/>
-          <w:bCs/>
-          <w:sz w:val="24"/>
-          <w:szCs w:val="24"/>
-        </w:rPr>
-      </w:pPr>
-      <w:r>
-        <w:rPr>
-          <w:b/>
-          <w:bCs/>
-          <w:sz w:val="24"/>
-          <w:szCs w:val="24"/>
-        </w:rPr>
-        <w:t>Union Representative in Attendance: {{ union_rep_attending }}</w:t>
-      </w:r>
-    </w:p>
-    <w:p ns2:paraId="19410A0F" ns2:textId="77777777">
-      <w:pPr>
-        <w:rPr>
-          <w:b/>
-          <w:bCs/>
-          <w:sz w:val="24"/>
-          <w:szCs w:val="24"/>
-        </w:rPr>
-      </w:pPr>
-    </w:p>
-    <w:p ns2:paraId="75C0BC7B" ns2:textId="14EC2F82">
-      <w:pPr>
-        <w:rPr>
-          <w:b/>
-          <w:bCs/>
-          <w:sz w:val="24"/>
-          <w:szCs w:val="24"/>
-        </w:rPr>
-      </w:pPr>
-      <w:r>
-        <w:rPr>
-          <w:b/>
-          <w:bCs/>
-          <w:sz w:val="24"/>
-          <w:szCs w:val="24"/>
-        </w:rPr>
-        <w:t>Issue and Article of Contract Involved: Article#: {{ issue_article }}</w:t>
+        <w:t xml:space="preserve"> </w:t>
       </w:r>
     </w:p>
     <w:p>
       <w:pPr>
-        <w:spacing w:before="0" w:after="0" w:line="240" w:lineRule="auto"/>
-        <w:ind w:left="0" w:right="0"/>
+        <w:spacing w:after="0" w:line="240" w:lineRule="auto"/>
       </w:pPr>
       <w:r>
         <w:rPr>
@@ -257,33 +700,44 @@
           <w:vanish/>
           <w:color w:val="FFFFFF"/>
           <w:sz w:val="2"/>
-          <w:u w:val="none"/>
         </w:rPr>
         <w:t>{% for row in issue_rows %}</w:t>
       </w:r>
     </w:p>
     <w:p>
       <w:pPr>
-        <w:spacing w:before="0" w:after="0" w:line="240" w:lineRule="auto"/>
-        <w:ind w:left="0" w:right="0"/>
         <w:pBdr>
           <w:bottom w:val="single" w:sz="6" w:space="1" w:color="808080"/>
         </w:pBdr>
+        <w:spacing w:after="0" w:line="240" w:lineRule="auto"/>
       </w:pPr>
       <w:r>
         <w:rPr>
           <w:rFonts w:ascii="Arial" w:hAnsi="Arial"/>
-          <w:vanish w:val="0"/>
           <w:sz w:val="24"/>
-          <w:u w:val="none"/>
-        </w:rPr>
-        <w:t>{{ row.text }}</w:t>
+        </w:rPr>
+        <w:t xml:space="preserve">{{ </w:t>
+      </w:r>
+      <w:proofErr w:type="spellStart"/>
+      <w:r>
+        <w:rPr>
+          <w:rFonts w:ascii="Arial" w:hAnsi="Arial"/>
+          <w:sz w:val="24"/>
+        </w:rPr>
+        <w:t>row.text</w:t>
+      </w:r>
+      <w:proofErr w:type="spellEnd"/>
+      <w:r>
+        <w:rPr>
+          <w:rFonts w:ascii="Arial" w:hAnsi="Arial"/>
+          <w:sz w:val="24"/>
+        </w:rPr>
+        <w:t xml:space="preserve"> }}</w:t>
       </w:r>
     </w:p>
     <w:p>
       <w:pPr>
-        <w:spacing w:before="0" w:after="0" w:line="240" w:lineRule="auto"/>
-        <w:ind w:left="0" w:right="0"/>
+        <w:spacing w:after="0" w:line="240" w:lineRule="auto"/>
       </w:pPr>
       <w:r>
         <w:rPr>
@@ -291,12 +745,11 @@
           <w:vanish/>
           <w:color w:val="FFFFFF"/>
           <w:sz w:val="2"/>
-          <w:u w:val="none"/>
         </w:rPr>
         <w:t>{% endfor %}</w:t>
       </w:r>
     </w:p>
-    <w:p ns2:paraId="1A14E894" ns2:textId="6166F3A2">
+    <w:p>
       <w:pPr>
         <w:rPr>
           <w:b/>
@@ -317,8 +770,7 @@
     </w:p>
     <w:p>
       <w:pPr>
-        <w:spacing w:before="0" w:after="0" w:line="240" w:lineRule="auto"/>
-        <w:ind w:left="0" w:right="0"/>
+        <w:spacing w:after="0" w:line="240" w:lineRule="auto"/>
       </w:pPr>
       <w:r>
         <w:rPr>
@@ -326,33 +778,44 @@
           <w:vanish/>
           <w:color w:val="FFFFFF"/>
           <w:sz w:val="2"/>
-          <w:u w:val="none"/>
         </w:rPr>
         <w:t>{% for row in settlement_rows %}</w:t>
       </w:r>
     </w:p>
     <w:p>
       <w:pPr>
-        <w:spacing w:before="0" w:after="0" w:line="240" w:lineRule="auto"/>
-        <w:ind w:left="0" w:right="0"/>
         <w:pBdr>
           <w:bottom w:val="single" w:sz="6" w:space="1" w:color="808080"/>
         </w:pBdr>
+        <w:spacing w:after="0" w:line="240" w:lineRule="auto"/>
       </w:pPr>
       <w:r>
         <w:rPr>
           <w:rFonts w:ascii="Arial" w:hAnsi="Arial"/>
-          <w:vanish w:val="0"/>
           <w:sz w:val="24"/>
-          <w:u w:val="none"/>
-        </w:rPr>
-        <w:t>{{ row.text }}</w:t>
+        </w:rPr>
+        <w:t xml:space="preserve">{{ </w:t>
+      </w:r>
+      <w:proofErr w:type="spellStart"/>
+      <w:r>
+        <w:rPr>
+          <w:rFonts w:ascii="Arial" w:hAnsi="Arial"/>
+          <w:sz w:val="24"/>
+        </w:rPr>
+        <w:t>row.text</w:t>
+      </w:r>
+      <w:proofErr w:type="spellEnd"/>
+      <w:r>
+        <w:rPr>
+          <w:rFonts w:ascii="Arial" w:hAnsi="Arial"/>
+          <w:sz w:val="24"/>
+        </w:rPr>
+        <w:t xml:space="preserve"> }}</w:t>
       </w:r>
     </w:p>
     <w:p>
       <w:pPr>
-        <w:spacing w:before="0" w:after="0" w:line="240" w:lineRule="auto"/>
-        <w:ind w:left="0" w:right="0"/>
+        <w:spacing w:after="0" w:line="240" w:lineRule="auto"/>
       </w:pPr>
       <w:r>
         <w:rPr>
@@ -360,12 +823,11 @@
           <w:vanish/>
           <w:color w:val="FFFFFF"/>
           <w:sz w:val="2"/>
-          <w:u w:val="none"/>
         </w:rPr>
         <w:t>{% endfor %}</w:t>
       </w:r>
     </w:p>
-    <w:p ns2:paraId="21B79177" ns2:textId="77777777">
+    <w:p>
       <w:pPr>
         <w:rPr>
           <w:b/>
@@ -375,82 +837,222 @@
         </w:rPr>
       </w:pPr>
     </w:p>
-    <w:p ns2:paraId="06B57E51" ns2:textId="15EE5257">
-      <w:pPr>
-        <w:rPr>
-          <w:b/>
-          <w:bCs/>
-          <w:sz w:val="24"/>
-          <w:szCs w:val="24"/>
-        </w:rPr>
-      </w:pPr>
-      <w:r>
-        <w:rPr>
-          <w:b/>
-          <w:bCs/>
-          <w:sz w:val="24"/>
-          <w:szCs w:val="24"/>
-        </w:rPr>
-        <w:t>{{ Sig_es_:signer1:signature }}                          {{ Sig_es_:signer2:signature }}</w:t>
-      </w:r>
-    </w:p>
-    <w:p ns2:paraId="673FDE6F" ns2:textId="4335DBB2">
-      <w:pPr>
-        <w:rPr>
-          <w:b/>
-          <w:bCs/>
-          <w:sz w:val="24"/>
-          <w:szCs w:val="24"/>
-        </w:rPr>
-      </w:pPr>
-      <w:r>
-        <w:rPr>
-          <w:b/>
-          <w:bCs/>
-          <w:sz w:val="24"/>
-          <w:szCs w:val="24"/>
-        </w:rPr>
-        <w:t>Company Representative Signature                          Steward Signature</w:t>
-      </w:r>
-    </w:p>
-    <w:p ns2:paraId="44A258AA" ns2:textId="7D8C624B">
-      <w:pPr>
-        <w:rPr>
-          <w:b/>
-          <w:bCs/>
-          <w:sz w:val="24"/>
-          <w:szCs w:val="24"/>
-        </w:rPr>
-      </w:pPr>
-      <w:r>
-        <w:rPr>
-          <w:b/>
-          <w:bCs/>
-          <w:sz w:val="24"/>
-          <w:szCs w:val="24"/>
-        </w:rPr>
-        <w:t>                                                                                           {{ Sig_es_:signer3:signature }}</w:t>
-      </w:r>
-    </w:p>
-    <w:p ns2:paraId="630E5731" ns2:textId="2CFDEC2F">
-      <w:pPr>
-        <w:rPr>
-          <w:b/>
-          <w:bCs/>
-          <w:sz w:val="24"/>
-          <w:szCs w:val="24"/>
-        </w:rPr>
-      </w:pPr>
-      <w:r>
-        <w:rPr>
-          <w:b/>
-          <w:bCs/>
-          <w:sz w:val="24"/>
-          <w:szCs w:val="24"/>
-        </w:rPr>
-        <w:t xml:space="preserve">                                                                                           Grievant Signature</w:t>
-      </w:r>
-    </w:p>
+    <w:tbl>
+      <w:tblPr>
+        <w:tblW w:w="9360" w:type="dxa"/>
+        <w:jc w:val="center"/>
+        <w:tblBorders>
+          <w:top w:val="single" w:sz="8" w:space="0" w:color="808080"/>
+          <w:left w:val="single" w:sz="8" w:space="0" w:color="808080"/>
+          <w:bottom w:val="single" w:sz="8" w:space="0" w:color="808080"/>
+          <w:right w:val="single" w:sz="8" w:space="0" w:color="808080"/>
+          <w:insideH w:val="single" w:sz="6" w:space="0" w:color="A0A0A0"/>
+          <w:insideV w:val="single" w:sz="6" w:space="0" w:color="A0A0A0"/>
+        </w:tblBorders>
+        <w:tblLayout w:type="fixed"/>
+        <w:tblLook w:val="04A0" w:firstRow="1" w:lastRow="0" w:firstColumn="1" w:lastColumn="0" w:noHBand="0" w:noVBand="1"/>
+      </w:tblPr>
+      <w:tblGrid>
+        <w:gridCol w:w="2520"/>
+        <w:gridCol w:w="4560"/>
+        <w:gridCol w:w="2280"/>
+      </w:tblGrid>
+      <w:tr>
+        <w:trPr>
+          <w:tblHeader/>
+          <w:jc w:val="center"/>
+        </w:trPr>
+        <w:tc>
+          <w:tcPr>
+            <w:tcW w:w="2520" w:type="dxa"/>
+            <w:shd w:val="clear" w:color="auto" w:fill="EDEDED"/>
+            <w:vAlign w:val="center"/>
+          </w:tcPr>
+          <w:p>
+            <w:pPr>
+              <w:jc w:val="center"/>
+            </w:pPr>
+            <w:r>
+              <w:rPr>
+                <w:b/>
+              </w:rPr>
+              <w:t>Signer Role</w:t>
+            </w:r>
+          </w:p>
+        </w:tc>
+        <w:tc>
+          <w:tcPr>
+            <w:tcW w:w="4560" w:type="dxa"/>
+            <w:shd w:val="clear" w:color="auto" w:fill="EDEDED"/>
+            <w:vAlign w:val="center"/>
+          </w:tcPr>
+          <w:p>
+            <w:pPr>
+              <w:jc w:val="center"/>
+            </w:pPr>
+            <w:r>
+              <w:rPr>
+                <w:b/>
+              </w:rPr>
+              <w:t>Signature</w:t>
+            </w:r>
+          </w:p>
+        </w:tc>
+        <w:tc>
+          <w:tcPr>
+            <w:tcW w:w="2280" w:type="dxa"/>
+            <w:shd w:val="clear" w:color="auto" w:fill="EDEDED"/>
+            <w:vAlign w:val="center"/>
+          </w:tcPr>
+          <w:p>
+            <w:pPr>
+              <w:jc w:val="center"/>
+            </w:pPr>
+            <w:r>
+              <w:rPr>
+                <w:b/>
+              </w:rPr>
+              <w:t>Date</w:t>
+            </w:r>
+          </w:p>
+        </w:tc>
+      </w:tr>
+      <w:tr>
+        <w:trPr>
+          <w:trHeight w:val="461"/>
+          <w:jc w:val="center"/>
+        </w:trPr>
+        <w:tc>
+          <w:tcPr>
+            <w:tcW w:w="2520" w:type="dxa"/>
+            <w:vAlign w:val="center"/>
+          </w:tcPr>
+          <w:p>
+            <w:r>
+              <w:t>Company Representative</w:t>
+            </w:r>
+          </w:p>
+        </w:tc>
+        <w:tc>
+          <w:tcPr>
+            <w:tcW w:w="4560" w:type="dxa"/>
+            <w:vAlign w:val="center"/>
+          </w:tcPr>
+          <w:p>
+            <w:pPr>
+              <w:jc w:val="center"/>
+            </w:pPr>
+            <w:r>
+              <w:t>{{ Sig_es_:signer1:signature }}</w:t>
+            </w:r>
+          </w:p>
+        </w:tc>
+        <w:tc>
+          <w:tcPr>
+            <w:tcW w:w="2280" w:type="dxa"/>
+            <w:vAlign w:val="center"/>
+          </w:tcPr>
+          <w:p>
+            <w:pPr>
+              <w:jc w:val="center"/>
+            </w:pPr>
+            <w:r>
+              <w:t>{{ Dte_es_:signer1:date }}</w:t>
+            </w:r>
+          </w:p>
+        </w:tc>
+      </w:tr>
+      <w:tr>
+        <w:trPr>
+          <w:trHeight w:val="461"/>
+          <w:jc w:val="center"/>
+        </w:trPr>
+        <w:tc>
+          <w:tcPr>
+            <w:tcW w:w="2520" w:type="dxa"/>
+            <w:vAlign w:val="center"/>
+          </w:tcPr>
+          <w:p>
+            <w:r>
+              <w:t>Steward</w:t>
+            </w:r>
+          </w:p>
+        </w:tc>
+        <w:tc>
+          <w:tcPr>
+            <w:tcW w:w="4560" w:type="dxa"/>
+            <w:vAlign w:val="center"/>
+          </w:tcPr>
+          <w:p>
+            <w:pPr>
+              <w:jc w:val="center"/>
+            </w:pPr>
+            <w:r>
+              <w:t>{{ Sig_es_:signer2:signature }}</w:t>
+            </w:r>
+          </w:p>
+        </w:tc>
+        <w:tc>
+          <w:tcPr>
+            <w:tcW w:w="2280" w:type="dxa"/>
+            <w:vAlign w:val="center"/>
+          </w:tcPr>
+          <w:p>
+            <w:pPr>
+              <w:jc w:val="center"/>
+            </w:pPr>
+            <w:r>
+              <w:t>{{ Dte_es_:signer2:date }}</w:t>
+            </w:r>
+          </w:p>
+        </w:tc>
+      </w:tr>
+      <w:tr>
+        <w:trPr>
+          <w:jc w:val="center"/>
+        </w:trPr>
+        <w:tc>
+          <w:tcPr>
+            <w:tcW w:w="2520" w:type="dxa"/>
+            <w:vAlign w:val="center"/>
+          </w:tcPr>
+          <w:p>
+            <w:r>
+              <w:t>Grievant</w:t>
+            </w:r>
+          </w:p>
+        </w:tc>
+        <w:tc>
+          <w:tcPr>
+            <w:tcW w:w="4560" w:type="dxa"/>
+            <w:vAlign w:val="center"/>
+          </w:tcPr>
+          <w:p>
+            <w:pPr>
+              <w:jc w:val="center"/>
+            </w:pPr>
+            <w:r>
+              <w:t>{{ Sig_es_:signer3:signature }}</w:t>
+            </w:r>
+          </w:p>
+        </w:tc>
+        <w:tc>
+          <w:tcPr>
+            <w:tcW w:w="2280" w:type="dxa"/>
+            <w:vAlign w:val="center"/>
+          </w:tcPr>
+          <w:p>
+            <w:pPr>
+              <w:jc w:val="center"/>
+            </w:pPr>
+            <w:r>
+              <w:t>{{ Dte_es_:signer3:date }}</w:t>
+            </w:r>
+          </w:p>
+        </w:tc>
+      </w:tr>
+    </w:tbl>
+    <w:p/>
     <w:sectPr>
       <w:pgSz w:w="12240" w:h="15840"/>
       <w:pgMar w:top="1440" w:right="1440" w:bottom="1440" w:left="1440" w:header="720" w:footer="720" w:gutter="0"/>
@@ -889,6 +1491,25 @@
     <w:semiHidden/>
     <w:unhideWhenUsed/>
   </w:style>
+  <w:style w:type="table" w:styleId="TableGrid">
+    <w:name w:val="Table Grid"/>
+    <w:basedOn w:val="TableNormal"/>
+    <w:uiPriority w:val="39"/>
+    <w:rsid w:val="00A63179"/>
+    <w:pPr>
+      <w:spacing w:after="0" w:line="240" w:lineRule="auto"/>
+    </w:pPr>
+    <w:tblPr>
+      <w:tblBorders>
+        <w:top w:val="single" w:sz="4" w:space="0" w:color="auto"/>
+        <w:left w:val="single" w:sz="4" w:space="0" w:color="auto"/>
+        <w:bottom w:val="single" w:sz="4" w:space="0" w:color="auto"/>
+        <w:right w:val="single" w:sz="4" w:space="0" w:color="auto"/>
+        <w:insideH w:val="single" w:sz="4" w:space="0" w:color="auto"/>
+        <w:insideV w:val="single" w:sz="4" w:space="0" w:color="auto"/>
+      </w:tblBorders>
+    </w:tblPr>
+  </w:style>
 </w:styles>
 </file>
 
@@ -1199,15 +1820,6 @@
 </file>
 
 <file path=customXml/item2.xml><?xml version="1.0" encoding="utf-8"?>
-<?mso-contentType ?>
-<FormTemplates xmlns="http://schemas.microsoft.com/sharepoint/v3/contenttype/forms">
-  <Display>DocumentLibraryForm</Display>
-  <Edit>DocumentLibraryForm</Edit>
-  <New>DocumentLibraryForm</New>
-</FormTemplates>
-</file>
-
-<file path=customXml/item3.xml><?xml version="1.0" encoding="utf-8"?>
 <ct:contentTypeSchema xmlns:ct="http://schemas.microsoft.com/office/2006/metadata/contentType" xmlns:ma="http://schemas.microsoft.com/office/2006/metadata/properties/metaAttributes" ct:_="" ma:_="" ma:contentTypeName="Document" ma:contentTypeID="0x010100CF401FCC4C6332498E88A030D2B41FF8" ma:contentTypeVersion="12" ma:contentTypeDescription="Create a new document." ma:contentTypeScope="" ma:versionID="16a3b254292baef34cbdcb4b121afb23">
   <xsd:schema xmlns:xsd="http://www.w3.org/2001/XMLSchema" xmlns:xs="http://www.w3.org/2001/XMLSchema" xmlns:p="http://schemas.microsoft.com/office/2006/metadata/properties" xmlns:ns2="cb25d0d9-51fa-4be1-a336-66080ee3c584" xmlns:ns3="d3f5cc49-4b4c-4a32-b982-49353bea1320" targetNamespace="http://schemas.microsoft.com/office/2006/metadata/properties" ma:root="true" ma:fieldsID="2ddeb5033a676a6a9af076efec043770" ns2:_="" ns3:_="">
     <xsd:import namespace="cb25d0d9-51fa-4be1-a336-66080ee3c584"/>
@@ -1408,6 +2020,15 @@
 </ct:contentTypeSchema>
 </file>
 
+<file path=customXml/item3.xml><?xml version="1.0" encoding="utf-8"?>
+<?mso-contentType ?>
+<FormTemplates xmlns="http://schemas.microsoft.com/sharepoint/v3/contenttype/forms">
+  <Display>DocumentLibraryForm</Display>
+  <Edit>DocumentLibraryForm</Edit>
+  <New>DocumentLibraryForm</New>
+</FormTemplates>
+</file>
+
 <file path=customXml/itemProps1.xml><?xml version="1.0" encoding="utf-8"?>
 <ds:datastoreItem xmlns:ds="http://schemas.openxmlformats.org/officeDocument/2006/customXml" ds:itemID="{027D02F2-0A99-4183-A5AA-1321552F6D12}">
   <ds:schemaRefs>
@@ -1420,13 +2041,28 @@
 </file>
 
 <file path=customXml/itemProps2.xml><?xml version="1.0" encoding="utf-8"?>
+<ds:datastoreItem xmlns:ds="http://schemas.openxmlformats.org/officeDocument/2006/customXml" ds:itemID="{9E6CF078-5131-4B9F-BD5C-FA5E7F77051A}">
+  <ds:schemaRefs>
+    <ds:schemaRef ds:uri="http://schemas.microsoft.com/office/2006/metadata/contentType"/>
+    <ds:schemaRef ds:uri="http://schemas.microsoft.com/office/2006/metadata/properties/metaAttributes"/>
+    <ds:schemaRef ds:uri="http://www.w3.org/2001/XMLSchema"/>
+    <ds:schemaRef ds:uri="http://schemas.microsoft.com/office/2006/metadata/properties"/>
+    <ds:schemaRef ds:uri="cb25d0d9-51fa-4be1-a336-66080ee3c584"/>
+    <ds:schemaRef ds:uri="d3f5cc49-4b4c-4a32-b982-49353bea1320"/>
+    <ds:schemaRef ds:uri="http://schemas.microsoft.com/office/2006/documentManagement/types"/>
+    <ds:schemaRef ds:uri="http://schemas.microsoft.com/office/infopath/2007/PartnerControls"/>
+    <ds:schemaRef ds:uri="http://schemas.openxmlformats.org/package/2006/metadata/core-properties"/>
+    <ds:schemaRef ds:uri="http://purl.org/dc/elements/1.1/"/>
+    <ds:schemaRef ds:uri="http://purl.org/dc/terms/"/>
+    <ds:schemaRef ds:uri="http://schemas.microsoft.com/internal/obd"/>
+  </ds:schemaRefs>
+</ds:datastoreItem>
+</file>
+
+<file path=customXml/itemProps3.xml><?xml version="1.0" encoding="utf-8"?>
 <ds:datastoreItem xmlns:ds="http://schemas.openxmlformats.org/officeDocument/2006/customXml" ds:itemID="{6E48C791-76E9-48AF-9FDE-B24C3A816F37}">
   <ds:schemaRefs>
     <ds:schemaRef ds:uri="http://schemas.microsoft.com/sharepoint/v3/contenttype/forms"/>
   </ds:schemaRefs>
 </ds:datastoreItem>
-</file>
-
-<file path=customXml/itemProps3.xml><?xml version="1.0" encoding="utf-8"?>
-<ds:datastoreItem xmlns:ds="http://schemas.openxmlformats.org/officeDocument/2006/customXml" ds:itemID="{9E6CF078-5131-4B9F-BD5C-FA5E7F77051A}"/>
 </file>
</xml_diff>

<commit_message>
fix: Update Settlement Form 3106 documentation for clarity and adjust signer configuration for two-signature flow
</commit_message>
<xml_diff>
--- a/Docx Files Template/Settlement Form 3106.docx
+++ b/Docx Files Template/Settlement Form 3106.docx
@@ -665,7 +665,7 @@
                 <w:sz w:val="24"/>
                 <w:szCs w:val="24"/>
               </w:rPr>
-              <w:t>Issue and Article of Contract Involved:</w:t>
+              <w:t>Issue:</w:t>
             </w:r>
           </w:p>
         </w:tc>
@@ -755,84 +755,6 @@
           <w:szCs w:val="24"/>
         </w:rPr>
         <w:t xml:space="preserve"> </w:t>
-      </w:r>
-    </w:p>
-    <w:p>
-      <w:pPr>
-        <w:rPr>
-          <w:b/>
-          <w:bCs/>
-          <w:sz w:val="24"/>
-          <w:szCs w:val="24"/>
-        </w:rPr>
-      </w:pPr>
-      <w:r>
-        <w:rPr>
-          <w:b/>
-          <w:bCs/>
-          <w:sz w:val="24"/>
-          <w:szCs w:val="24"/>
-        </w:rPr>
-        <w:t>Settlement:</w:t>
-      </w:r>
-    </w:p>
-    <w:p>
-      <w:pPr>
-        <w:spacing w:after="0" w:line="240" w:lineRule="auto"/>
-      </w:pPr>
-      <w:r>
-        <w:rPr>
-          <w:rFonts w:ascii="Arial" w:hAnsi="Arial"/>
-          <w:vanish/>
-          <w:color w:val="FFFFFF"/>
-          <w:sz w:val="2"/>
-        </w:rPr>
-        <w:t>{% for row in settlement_rows %}</w:t>
-      </w:r>
-    </w:p>
-    <w:p>
-      <w:pPr>
-        <w:pBdr>
-          <w:bottom w:val="single" w:sz="6" w:space="1" w:color="808080"/>
-        </w:pBdr>
-        <w:spacing w:after="0" w:line="240" w:lineRule="auto"/>
-      </w:pPr>
-      <w:r>
-        <w:rPr>
-          <w:rFonts w:ascii="Arial" w:hAnsi="Arial"/>
-          <w:sz w:val="24"/>
-        </w:rPr>
-        <w:t xml:space="preserve">{{ </w:t>
-      </w:r>
-      <w:proofErr w:type="spellStart"/>
-      <w:r>
-        <w:rPr>
-          <w:rFonts w:ascii="Arial" w:hAnsi="Arial"/>
-          <w:sz w:val="24"/>
-        </w:rPr>
-        <w:t>row.text</w:t>
-      </w:r>
-      <w:proofErr w:type="spellEnd"/>
-      <w:r>
-        <w:rPr>
-          <w:rFonts w:ascii="Arial" w:hAnsi="Arial"/>
-          <w:sz w:val="24"/>
-        </w:rPr>
-        <w:t xml:space="preserve"> }}</w:t>
-      </w:r>
-    </w:p>
-    <w:p>
-      <w:pPr>
-        <w:spacing w:after="0" w:line="240" w:lineRule="auto"/>
-      </w:pPr>
-      <w:r>
-        <w:rPr>
-          <w:rFonts w:ascii="Arial" w:hAnsi="Arial"/>
-          <w:vanish/>
-          <w:color w:val="FFFFFF"/>
-          <w:sz w:val="2"/>
-        </w:rPr>
-        <w:t>{% endfor %}</w:t>
       </w:r>
     </w:p>
     <w:p>
@@ -1011,50 +933,6 @@
             </w:pPr>
             <w:r>
               <w:t>{{ Dte_es_:signer2:date }}</w:t>
-            </w:r>
-          </w:p>
-        </w:tc>
-      </w:tr>
-      <w:tr>
-        <w:trPr>
-          <w:jc w:val="center"/>
-        </w:trPr>
-        <w:tc>
-          <w:tcPr>
-            <w:tcW w:w="2520" w:type="dxa"/>
-            <w:vAlign w:val="center"/>
-          </w:tcPr>
-          <w:p>
-            <w:r>
-              <w:t>Grievant</w:t>
-            </w:r>
-          </w:p>
-        </w:tc>
-        <w:tc>
-          <w:tcPr>
-            <w:tcW w:w="4560" w:type="dxa"/>
-            <w:vAlign w:val="center"/>
-          </w:tcPr>
-          <w:p>
-            <w:pPr>
-              <w:jc w:val="center"/>
-            </w:pPr>
-            <w:r>
-              <w:t>{{ Sig_es_:signer3:signature }}</w:t>
-            </w:r>
-          </w:p>
-        </w:tc>
-        <w:tc>
-          <w:tcPr>
-            <w:tcW w:w="2280" w:type="dxa"/>
-            <w:vAlign w:val="center"/>
-          </w:tcPr>
-          <w:p>
-            <w:pPr>
-              <w:jc w:val="center"/>
-            </w:pPr>
-            <w:r>
-              <w:t>{{ Dte_es_:signer3:date }}</w:t>
             </w:r>
           </w:p>
         </w:tc>

</xml_diff>

<commit_message>
Add unit tests for grievance operations including document catalog loading and resubmission
</commit_message>
<xml_diff>
--- a/Docx Files Template/Settlement Form 3106.docx
+++ b/Docx Files Template/Settlement Form 3106.docx
@@ -1,6 +1,6 @@
 
 <file path=word/document.xml><?xml version="1.0" encoding="utf-8"?>
-<w:document xmlns:wpc="http://schemas.microsoft.com/office/word/2010/wordprocessingCanvas" xmlns:cx="http://schemas.microsoft.com/office/drawing/2014/chartex" xmlns:cx1="http://schemas.microsoft.com/office/drawing/2015/9/8/chartex" xmlns:cx2="http://schemas.microsoft.com/office/drawing/2015/10/21/chartex" xmlns:cx3="http://schemas.microsoft.com/office/drawing/2016/5/9/chartex" xmlns:cx4="http://schemas.microsoft.com/office/drawing/2016/5/10/chartex" xmlns:cx5="http://schemas.microsoft.com/office/drawing/2016/5/11/chartex" xmlns:cx6="http://schemas.microsoft.com/office/drawing/2016/5/12/chartex" xmlns:cx7="http://schemas.microsoft.com/office/drawing/2016/5/13/chartex" xmlns:cx8="http://schemas.microsoft.com/office/drawing/2016/5/14/chartex" xmlns:mc="http://schemas.openxmlformats.org/markup-compatibility/2006" xmlns:aink="http://schemas.microsoft.com/office/drawing/2016/ink" xmlns:am3d="http://schemas.microsoft.com/office/drawing/2017/model3d" xmlns:o="urn:schemas-microsoft-com:office:office" xmlns:oel="http://schemas.microsoft.com/office/2019/extlst" xmlns:r="http://schemas.openxmlformats.org/officeDocument/2006/relationships" xmlns:m="http://schemas.openxmlformats.org/officeDocument/2006/math" xmlns:v="urn:schemas-microsoft-com:vml" xmlns:wp14="http://schemas.microsoft.com/office/word/2010/wordprocessingDrawing" xmlns:wp="http://schemas.openxmlformats.org/drawingml/2006/wordprocessingDrawing" xmlns:w10="urn:schemas-microsoft-com:office:word" xmlns:w="http://schemas.openxmlformats.org/wordprocessingml/2006/main" xmlns:w14="http://schemas.microsoft.com/office/word/2010/wordml" xmlns:w15="http://schemas.microsoft.com/office/word/2012/wordml" xmlns:w16cex="http://schemas.microsoft.com/office/word/2018/wordml/cex" xmlns:w16cid="http://schemas.microsoft.com/office/word/2016/wordml/cid" xmlns:w16="http://schemas.microsoft.com/office/word/2018/wordml" xmlns:w16du="http://schemas.microsoft.com/office/word/2023/wordml/word16du" xmlns:w16sdtdh="http://schemas.microsoft.com/office/word/2020/wordml/sdtdatahash" xmlns:w16sdtfl="http://schemas.microsoft.com/office/word/2024/wordml/sdtformatlock" xmlns:w16se="http://schemas.microsoft.com/office/word/2015/wordml/symex" xmlns:wpg="http://schemas.microsoft.com/office/word/2010/wordprocessingGroup" xmlns:wpi="http://schemas.microsoft.com/office/word/2010/wordprocessingInk" xmlns:wne="http://schemas.microsoft.com/office/word/2006/wordml" xmlns:wps="http://schemas.microsoft.com/office/word/2010/wordprocessingShape" mc:Ignorable="w14 w15 w16se w16cid w16 w16cex w16sdtdh w16sdtfl w16du wp14">
+<w:document xmlns:mc="http://schemas.openxmlformats.org/markup-compatibility/2006" xmlns:ns5="http://schemas.openxmlformats.org/drawingml/2006/main" xmlns:ns6="http://schemas.openxmlformats.org/drawingml/2006/picture" xmlns:ns8="http://schemas.microsoft.com/office/drawing/2010/main" xmlns:r="http://schemas.openxmlformats.org/officeDocument/2006/relationships" xmlns:w="http://schemas.openxmlformats.org/wordprocessingml/2006/main" xmlns:w14="http://schemas.microsoft.com/office/word/2010/wordml" xmlns:wp="http://schemas.openxmlformats.org/drawingml/2006/wordprocessingDrawing" xmlns:wp14="http://schemas.microsoft.com/office/word/2010/wordprocessingDrawing" mc:Ignorable="w14 w15 w16se w16cid w16 w16cex w16sdtdh w16sdtfl w16du wp14">
   <w:body>
     <w:p>
       <w:pPr>
@@ -22,39 +22,39 @@
             <wp:effectExtent l="0" t="0" r="0" b="0"/>
             <wp:docPr id="1935443103" name="Picture 1" descr="A red and white logo with a chain around it&#10;&#10;Description automatically generated"/>
             <wp:cNvGraphicFramePr>
-              <a:graphicFrameLocks xmlns:a="http://schemas.openxmlformats.org/drawingml/2006/main" noChangeAspect="1"/>
+              <ns5:graphicFrameLocks noChangeAspect="1"/>
             </wp:cNvGraphicFramePr>
-            <a:graphic xmlns:a="http://schemas.openxmlformats.org/drawingml/2006/main">
-              <a:graphicData uri="http://schemas.openxmlformats.org/drawingml/2006/picture">
-                <pic:pic xmlns:pic="http://schemas.openxmlformats.org/drawingml/2006/picture">
-                  <pic:nvPicPr>
-                    <pic:cNvPr id="1935443103" name="Picture 1" descr="A red and white logo with a chain around it&#10;&#10;Description automatically generated"/>
-                    <pic:cNvPicPr/>
-                  </pic:nvPicPr>
-                  <pic:blipFill>
-                    <a:blip r:embed="rId7" cstate="print">
-                      <a:extLst>
-                        <a:ext uri="{28A0092B-C50C-407E-A947-70E740481C1C}">
-                          <a14:useLocalDpi xmlns:a14="http://schemas.microsoft.com/office/drawing/2010/main" val="0"/>
-                        </a:ext>
-                      </a:extLst>
-                    </a:blip>
-                    <a:stretch>
-                      <a:fillRect/>
-                    </a:stretch>
-                  </pic:blipFill>
-                  <pic:spPr>
-                    <a:xfrm>
-                      <a:off x="0" y="0"/>
-                      <a:ext cx="1104031" cy="675983"/>
-                    </a:xfrm>
-                    <a:prstGeom prst="rect">
-                      <a:avLst/>
-                    </a:prstGeom>
-                  </pic:spPr>
-                </pic:pic>
-              </a:graphicData>
-            </a:graphic>
+            <ns5:graphic>
+              <ns5:graphicData uri="http://schemas.openxmlformats.org/drawingml/2006/picture">
+                <ns6:pic>
+                  <ns6:nvPicPr>
+                    <ns6:cNvPr id="1935443103" name="Picture 1" descr="A red and white logo with a chain around it&#10;&#10;Description automatically generated"/>
+                    <ns6:cNvPicPr/>
+                  </ns6:nvPicPr>
+                  <ns6:blipFill>
+                    <ns5:blip r:embed="rId7" cstate="print">
+                      <ns5:extLst>
+                        <ns5:ext uri="{28A0092B-C50C-407E-A947-70E740481C1C}">
+                          <ns8:useLocalDpi val="0"/>
+                        </ns5:ext>
+                      </ns5:extLst>
+                    </ns5:blip>
+                    <ns5:stretch>
+                      <ns5:fillRect/>
+                    </ns5:stretch>
+                  </ns6:blipFill>
+                  <ns6:spPr>
+                    <ns5:xfrm>
+                      <ns5:off x="0" y="0"/>
+                      <ns5:ext cx="1104031" cy="675983"/>
+                    </ns5:xfrm>
+                    <ns5:prstGeom prst="rect">
+                      <ns5:avLst/>
+                    </ns5:prstGeom>
+                  </ns6:spPr>
+                </ns6:pic>
+              </ns5:graphicData>
+            </ns5:graphic>
           </wp:inline>
         </w:drawing>
       </w:r>
@@ -62,8 +62,8 @@
         <w:rPr>
           <w:b/>
           <w:bCs/>
-          <w:sz w:val="28"/>
-          <w:szCs w:val="28"/>
+          <w:sz w:val="22"/>
+          <w:szCs w:val="22"/>
           <w:u w:val="single"/>
         </w:rPr>
         <w:t>Communications Workers of America Local 3106, AFL</w:t>
@@ -72,8 +72,8 @@
         <w:rPr>
           <w:b/>
           <w:bCs/>
-          <w:sz w:val="28"/>
-          <w:szCs w:val="28"/>
+          <w:sz w:val="22"/>
+          <w:szCs w:val="22"/>
           <w:u w:val="single"/>
         </w:rPr>
         <w:t>-</w:t>
@@ -82,8 +82,8 @@
         <w:rPr>
           <w:b/>
           <w:bCs/>
-          <w:sz w:val="28"/>
-          <w:szCs w:val="28"/>
+          <w:sz w:val="22"/>
+          <w:szCs w:val="22"/>
           <w:u w:val="single"/>
         </w:rPr>
         <w:t>CIO</w:t>
@@ -328,8 +328,8 @@
         <w:tblLook w:val="04A0" w:firstRow="1" w:lastRow="0" w:firstColumn="1" w:lastColumn="0" w:noHBand="0" w:noVBand="1"/>
       </w:tblPr>
       <w:tblGrid>
-        <w:gridCol w:w="1054"/>
-        <w:gridCol w:w="2945"/>
+        <w:gridCol w:w="1700"/>
+        <w:gridCol w:w="2299"/>
         <w:gridCol w:w="268"/>
         <w:gridCol w:w="530"/>
         <w:gridCol w:w="4563"/>
@@ -569,7 +569,7 @@
       <w:tr>
         <w:tc>
           <w:tcPr>
-            <w:tcW w:w="1054" w:type="dxa"/>
+            <w:tcW w:w="1700" w:type="dxa"/>
             <w:tcBorders>
               <w:top w:val="nil"/>
               <w:left w:val="nil"/>
@@ -593,13 +593,13 @@
                 <w:sz w:val="24"/>
                 <w:szCs w:val="24"/>
               </w:rPr>
-              <w:t xml:space="preserve">Article#: </w:t>
-            </w:r>
-          </w:p>
-        </w:tc>
-        <w:tc>
-          <w:tcPr>
-            <w:tcW w:w="8306" w:type="dxa"/>
+              <w:t>Article:</w:t>
+            </w:r>
+          </w:p>
+        </w:tc>
+        <w:tc>
+          <w:tcPr>
+            <w:tcW w:w="7660" w:type="dxa"/>
             <w:gridSpan w:val="4"/>
             <w:tcBorders>
               <w:top w:val="nil"/>
@@ -766,6 +766,69 @@
           <w:szCs w:val="24"/>
         </w:rPr>
       </w:pPr>
+    </w:p>
+    <w:p>
+      <w:pPr>
+        <w:spacing w:after="0"/>
+      </w:pPr>
+      <w:r>
+        <w:t xml:space="preserve"> </w:t>
+      </w:r>
+    </w:p>
+    <w:p>
+      <w:pPr>
+        <w:spacing w:after="0"/>
+      </w:pPr>
+      <w:r>
+        <w:rPr>
+          <w:b/>
+          <w:sz w:val="24"/>
+        </w:rPr>
+        <w:t>Settlement:</w:t>
+      </w:r>
+    </w:p>
+    <w:p>
+      <w:pPr>
+        <w:spacing w:after="0" w:line="240" w:lineRule="auto"/>
+      </w:pPr>
+      <w:r>
+        <w:rPr>
+          <w:rFonts w:ascii="Arial" w:hAnsi="Arial"/>
+          <w:vanish/>
+          <w:color w:val="FFFFFF"/>
+          <w:sz w:val="2"/>
+        </w:rPr>
+        <w:t>{% for row in settlement_rows %}</w:t>
+      </w:r>
+    </w:p>
+    <w:p>
+      <w:pPr>
+        <w:spacing w:after="0" w:line="240" w:lineRule="auto"/>
+        <w:pBdr>
+          <w:bottom w:val="single" w:sz="6" w:space="1" w:color="808080"/>
+        </w:pBdr>
+      </w:pPr>
+      <w:r>
+        <w:rPr>
+          <w:rFonts w:ascii="Arial" w:hAnsi="Arial"/>
+          <w:sz w:val="24"/>
+        </w:rPr>
+        <w:t>{{ row.text }}</w:t>
+      </w:r>
+    </w:p>
+    <w:p>
+      <w:pPr>
+        <w:spacing w:after="0" w:line="240" w:lineRule="auto"/>
+      </w:pPr>
+      <w:r>
+        <w:rPr>
+          <w:rFonts w:ascii="Arial" w:hAnsi="Arial"/>
+          <w:vanish/>
+          <w:color w:val="FFFFFF"/>
+          <w:sz w:val="2"/>
+        </w:rPr>
+        <w:t>{% endfor %}</w:t>
+      </w:r>
     </w:p>
     <w:tbl>
       <w:tblPr>

</xml_diff>